<commit_message>
Use full institution name: Universitas Sultan Ageng Tirtayasa
Ganti akronim UNTIRTA dengan nama resmi lengkap di jawaban form,
README, pitch deck, dan Word doc (regenerated).

Co-Authored-By: Claude Opus 4.8 <noreply@anthropic.com>
</commit_message>
<xml_diff>
--- a/Proposal_Tahap_2_FinCrime.docx
+++ b/Proposal_Tahap_2_FinCrime.docx
@@ -389,7 +389,7 @@
                 <w:sz w:val="20"/>
                 <w:szCs w:val="20"/>
               </w:rPr>
-              <w:t xml:space="preserve">Universitas Gunadarma &amp; UNTIRTA</w:t>
+              <w:t xml:space="preserve">Universitas Gunadarma &amp; Universitas Sultan Ageng Tirtayasa</w:t>
             </w:r>
           </w:p>
         </w:tc>
@@ -1441,7 +1441,7 @@
                 <w:sz w:val="20"/>
                 <w:szCs w:val="20"/>
               </w:rPr>
-              <w:t xml:space="preserve">UNTIRTA</w:t>
+              <w:t xml:space="preserve">Universitas Sultan Ageng Tirtayasa</w:t>
             </w:r>
           </w:p>
         </w:tc>
@@ -13422,7 +13422,7 @@
           <w:sz w:val="22"/>
           <w:szCs w:val="22"/>
         </w:rPr>
-        <w:t xml:space="preserve">Gunadarma + UNTIRTA, BI Institute, ITB/UI/UGM. Chainalysis/Elliptic data sharing, World Bank Financial Inclusion.</w:t>
+        <w:t xml:space="preserve">Gunadarma + Universitas Sultan Ageng Tirtayasa, BI Institute, ITB/UI/UGM. Chainalysis/Elliptic data sharing, World Bank Financial Inclusion.</w:t>
       </w:r>
     </w:p>
     <w:p>

</xml_diff>